<commit_message>
Guides: regenerate guides.json and the v22.54 Word guide after the audit fixes
Co-Authored-By: Claude Opus 5.5 <noreply@anthropic.com>
Claude-Session: https://claude.ai/code/session_01T49gnSNZq31rPRt1vHk4Rc
</commit_message>
<xml_diff>
--- a/nexidoc/Nexi_User_Guide_v22.54.docx
+++ b/nexidoc/Nexi_User_Guide_v22.54.docx
@@ -9649,6 +9649,24 @@
         <w:pStyle w:val="Heading2"/>
       </w:pPr>
       <w:r>
+        <w:t>🔒 Office pay and loyalty on the HR card (v22.54)</w:t>
+      </w:r>
+    </w:p>
+    <w:p>
+      <w:r>
+        <w:t>On the card of an OFFICE employee, the 💼 Contract Pay part — Monthly Basic, Fixed EWT, allowances — opens only for people with 🏢 Office pay (owner-granted, Administration guide); anyone else does not see it, and saving the card keeps the stored figures. The 💰 Loyalty savings amount opens only with 💎 Loyalty. Labor employees’ allowances show as before.</w:t>
+      </w:r>
+    </w:p>
+    <w:p>
+      <w:r>
+        <w:t>The 💰 labor-rate flag and an admin role show LABOR rates only: on an office card the Daily Rate box is empty and greyed with “Not used — pay comes from the Monthly Basic (🔒 office pay — owner-granted)”, the 📄 contract’s Base salary reads “🔒 Restricted — office pay is owner-granted”, and the HR list shows 🔒 instead of the office person’s rate per day.</w:t>
+      </w:r>
+    </w:p>
+    <w:p>
+      <w:pPr>
+        <w:pStyle w:val="Heading2"/>
+      </w:pPr>
+      <w:r>
         <w:t>Job descriptions (v22.28)</w:t>
       </w:r>
     </w:p>
@@ -10076,12 +10094,35 @@
         <w:pStyle w:val="Heading2"/>
       </w:pPr>
       <w:r>
+        <w:t>🔒 Office pay inside Labor Payroll (v22.54)</w:t>
+      </w:r>
+    </w:p>
+    <w:p>
+      <w:r>
+        <w:t>When the owner takes 🏢 Office pay away from a pay-list person (Jinky, Dr Amy), 👷 Labor Payroll stays open for her, but nothing on it shows an office salary: 🧮 Final Pay lists and prices labor employees only; 🏛 Gov monthly shows the Labor column only (“🔒 Office (semi-monthly) is not shown”, TOTAL is labor only — also in Print and Excel); ⭐ Special payroll (the fix-base executives) and 📋 BIR / Reports say “🔒 … owner-granted (🏢 Office pay)”.</w:t>
+      </w:r>
+    </w:p>
+    <w:p>
+      <w:r>
+        <w:t>📋 BIR / Reports (Full Alphalist, BIR Alphalist CSV, Form 2316, Annual Payroll Register, YTD Ledger) lists every office employee, so it opens only for the pay name list WITH 🏢 Office pay — from the payroll toolbar, the coverage strip and Nexi’s Desk alike. An accounting role or an admin-role account outside the pay name list no longer opens it.</w:t>
+      </w:r>
+    </w:p>
+    <w:p>
+      <w:pPr>
+        <w:pStyle w:val="Heading2"/>
+      </w:pPr>
+      <w:r>
         <w:t>🔁 QB Recon: load the QuickBooks export (v22.52)</w:t>
       </w:r>
     </w:p>
     <w:p>
       <w:r>
         <w:t>The 🏛 2026 government JE audit tab compares Nexi payroll with the QuickBooks Balance Sheet and Profit &amp; Loss per employee account. That export used to be built into the page, where anyone could read it in View Source; it is loaded from the file now — 📥 Load the QuickBooks export (the JSON export with months, rows and summary). It stays on the computer that loaded it — never synced and never in the daily cloud backup — and opens only for people with 🏢 Office pay. The other QB Recon tabs read the live QuickBooks copy as before.</w:t>
+      </w:r>
+    </w:p>
+    <w:p>
+      <w:r>
+        <w:t>How (v22.54): Eyal has the file (qbpay-2026.json) — ask him for it. Payroll → 🔁 QB Recon → 🏛 2026 government JE audit → 📥 Choose file → pick it. Do this once on each computer you use; the audit and 🖨 Print JE open straight away.</w:t>
       </w:r>
     </w:p>
     <w:p>
@@ -15310,6 +15351,19 @@
         <w:pStyle w:val="Heading2"/>
       </w:pPr>
       <w:r>
+        <w:t>Deleting a remittance (v22.54)</w:t>
+      </w:r>
+    </w:p>
+    <w:p>
+      <w:r>
+        <w:t>🗑 Delete on a remittance now stays deleted on every computer: the plan remembers the deleted remittance, so a computer that still held it can no longer bring it back with its next upload (before v22.54 it came back after the sync). A new remittance is never hidden by this.</w:t>
+      </w:r>
+    </w:p>
+    <w:p>
+      <w:pPr>
+        <w:pStyle w:val="Heading2"/>
+      </w:pPr>
+      <w:r>
         <w:t>Where the figures come from</w:t>
       </w:r>
     </w:p>
@@ -15392,6 +15446,54 @@
         <w:pStyle w:val="Heading2"/>
       </w:pPr>
       <w:r>
+        <w:t>🛑 A Purchasing screen left open on another computer (v22.54)</w:t>
+      </w:r>
+    </w:p>
+    <w:p>
+      <w:r>
+        <w:t>The Purchasing screen does not redraw by itself when another computer changes a request, so a screen left open can show a stage the request has already left. Every button that moves a request — 🚀 Submit, 🤖 Run AI analysis, ✅ Accept and ✋ Override, the ✅ … proceed buttons, 📨 Create RFQ and ➡ Continue with RFQ-…, ➡ Move to receiving, 📦 Record GRN and ✅ Complete — first reads the request again. If it was sent back, moved on or cancelled meanwhile, nothing is changed: a message says where it is now and the screen is drawn again.</w:t>
+      </w:r>
+    </w:p>
+    <w:p>
+      <w:r>
+        <w:t>A CANCELLED request never moves again from a stage button — only Admin reopens it, with ↩ Reopen… on its stage card.</w:t>
+      </w:r>
+    </w:p>
+    <w:p>
+      <w:r>
+        <w:t>➡ Move to receiving works only on the purchase order the screen showed, and only once it is issued: a request sent back and awarded again is at Purchase Order on a NEW draft PO — issue it first. Goods are received (📦 Record GRN) only while the request is at Receiving, on the purchase order the screen showed; nothing is received on a draft, cancelled or closed PO. ✅ Complete needs the request at Receiving with an issued purchase order.</w:t>
+      </w:r>
+    </w:p>
+    <w:p>
+      <w:r>
+        <w:t>An RFQ that still says Awarded although its award was undone on another computer (no issued PO holds it) is offered again at Supplier Sourcing: “RFQ-… is still open”, ➡ Continue with RFQ-… and ➕ Add the selected to RFQ-…. Pressing either opens it again with every offer and cancels the draft PO left behind — a second RFQ is never made next to it.</w:t>
+      </w:r>
+    </w:p>
+    <w:p>
+      <w:r>
+        <w:t>An older copy of Nexi (the rollback copy, or a computer that has not reloaded yet) does not know this and can make a NEW RFQ for a request that was sent back to Supplier Sourcing, leaving the old RFQ and its offers open on the side. Back on this copy the stage card says “RFQ-… is also open for PR-…”: a Buyer presses ⇄ Bring its suppliers and offers into RFQ-… — suppliers missing from the request's RFQ are added with their offers, options and final offers, a supplier on both keeps the offer it has here, and the old RFQ is closed as merged (kept in the RFQ list, nothing deleted).</w:t>
+      </w:r>
+    </w:p>
+    <w:p>
+      <w:r>
+        <w:t>📎 Upload final offer pressed again while the file is still uploading is refused (“still uploading”) — the final offer is saved once, Eyal and Dr Amy are told once. If another computer saved an offer or a final offer for that supplier while the file was uploading, nothing is saved: check the offer, then upload again if it is still needed.</w:t>
+      </w:r>
+    </w:p>
+    <w:p>
+      <w:r>
+        <w:t>Items added to a request after its approval (➕ Add an item at the RFQ or the evaluation) are checked before the award on EVERY computer: the evaluation and the award step say “Items were added after approval” with ✔ Added items checked for Jinky (Eyal or Dr Amy when the request grew a lot), and 🏅 Approve award is refused until then.</w:t>
+      </w:r>
+    </w:p>
+    <w:p>
+      <w:r>
+        <w:t>Cancelled requests are not counted as open: Mission Control (open, Open value, past need-by alerts, priority queue), 📈 Analytics (Open PRs) and the Accounting cockpit “Purchase requests” (open, stalled for over three weeks) leave them out.</w:t>
+      </w:r>
+    </w:p>
+    <w:p>
+      <w:pPr>
+        <w:pStyle w:val="Heading2"/>
+      </w:pPr>
+      <w:r>
         <w:t>➕ Suppliers and Option B at evaluation (v22.52)</w:t>
       </w:r>
     </w:p>
@@ -15463,7 +15565,7 @@
     </w:p>
     <w:p>
       <w:r>
-        <w:t>Office salaries and the Loyalty program are owner-granted (Administration guide). An Accounting user without them sees the QuickBooks reports with one “🔒 Office pay (restricted)” and one “🔒 Loyalty program (restricted)” row per group in place of the named pay and loyalty accounts — the amounts are added together, so totals, the trial balance, the Matrices and the Financial Statements still agree; labor and production wages show as before. Ledger lines keep their amounts, but a payee, memo or split account naming an office employee reads “🔒 Office payroll”. 🏦 Bank &amp; Card Recon keeps the QuickBooks lines exactly as QuickBooks sent them (so matching works the same on every computer) and shows such a payee or account as “🔒 Office payroll” on the screen, in the 🔗 link QB line list and in the CSV. The QuickBooks copies each computer keeps (books, 12-month, aging, cash flow) are never synced: every computer reads them from QuickBooks itself.</w:t>
+        <w:t>Office salaries and the Loyalty program are owner-granted (Administration guide). An Accounting user without them sees the QuickBooks reports with one “🔒 Office pay (restricted)” and one “🔒 Loyalty program (restricted)” row per group in place of the named pay and loyalty accounts — the amounts are added together, so totals, the trial balance, the Matrices and the Financial Statements still agree; labor and production wages show as before. Ledger lines keep their amounts, but a payee, memo or split account naming an office employee reads “🔒 Office payroll”. 🏦 Bank &amp; Card Recon keeps the QuickBooks lines exactly as QuickBooks sent them (so matching works the same on every computer) and shows such a payee or account as “🔒 Office payroll” on the screen, in the 🔗 link QB line list and in the CSV. Since v22.54 the ✎ journal-entry DEBIT list never offers a 🔒 row (it is not a real QuickBooks account): a 🔒 account typed in is refused, and 🤖 Auto-JE ignores a rule that carries one — an office-pay holder categorises such a line. The QuickBooks copies each computer keeps (books, 12-month, aging, cash flow) are never synced: every computer reads them from QuickBooks itself.</w:t>
       </w:r>
     </w:p>
     <w:p>
@@ -16453,6 +16555,11 @@
     <w:p>
       <w:r>
         <w:t>The 💰 column is the labor-rate flag (HR daily rates, Production training rates, the labor lines of the payroll reports); the primary admin toggles it as before. It never opens office pay or loyalty.</w:t>
+      </w:r>
+    </w:p>
+    <w:p>
+      <w:r>
+        <w:t>Since v22.54 the same rule also covers: 📋 BIR / Reports (from every button and from Nexi’s Desk), 🧮 Final Pay, 🏛 Gov monthly and ⭐ Special payroll on Labor Payroll, the HR card’s 💼 Contract Pay part and 💰 Loyalty amount, the office Daily Rate note, the contract’s Base salary and the HR list’s office rates. QuickBooks: the first pull after opening Nexi waits until the mask is in place, the ☁ QB Sync copy is masked when it is read, and when somebody with MORE access signs in (or the page pulled while nobody was signed in) Nexi reads QuickBooks again for him — no reload. A masked row keeps its amount (“🔒 Office pay (restricted)” ₱ total) and its indentation.</w:t>
       </w:r>
     </w:p>
     <w:p>

</xml_diff>